<commit_message>
Final docs refresh: README roles/failover/gazetteer, group report v1.1, audit Appendix B updates, trilingual role test queries
</commit_message>
<xml_diff>
--- a/FINAL_REPORT_IT3041_Climora_AI.docx
+++ b/FINAL_REPORT_IT3041_Climora_AI.docx
@@ -93,7 +93,7 @@
     </w:p>
     <w:p>
       <w:r>
-        <w:t>This report presents the design, implementation and evaluation of Climora AI, a multi-agent climate intelligence and decision support system developed for Sri Lanka. The system addresses the fragmentation of climate information, language barriers in accessing advisories, and the lack of actionable, trustworthy guidance for the public. It coordinates seven specialised intelligent agents under an orchestrator, integrating large language models, natural language processing, information retrieval, verification and security controls through a standardised agent communication protocol. The system accepts queries in English, Sinhala and Tamil, retrieves supporting evidence from a curated knowledge base and live meteorological services, assesses risk transparently, verifies claims, and produces actionable recommendations with cited sources, confidence estimates and safety disclaimers. Evaluation on a golden set of sixteen queries achieved complete accuracy in location and topic identification and a top-three retrieval hit rate of eighty-one percent. End-to-end assessment of eleven queries across three languages achieved full scores on language fidelity, source citation, risk assessment, recommendations, verification and disclaimer presence. Responsible artificial intelligence principles of grounding, transparency, fairness, privacy and accountability were embedded throughout the lifecycle. A tiered commercialisation model with enforced usage controls and a deployment strategy is presented.</w:t>
+        <w:t>This report presents the design, implementation and evaluation of Climora AI, a multi-agent climate intelligence and decision support system developed for Sri Lanka. The system addresses the fragmentation of climate information, language barriers in accessing advisories, and the lack of actionable, trustworthy guidance for the public. It coordinates seven specialised intelligent agents under an orchestrator, integrating large language models, natural language processing, information retrieval, verification and security controls through a standardised agent communication protocol. The system accepts queries in English, Sinhala and Tamil, infers the user's role across seven types with query wording overriding stored settings, retrieves supporting evidence from a curated knowledge base and live meteorological services, assesses risk transparently, verifies claims, and produces actionable recommendations with cited sources, confidence estimates and safety disclaimers. Evaluation on a golden set of sixteen queries achieved complete accuracy in location and topic identification and a top-three retrieval hit rate of eighty-one percent. End-to-end assessment of eleven queries across three languages achieved full scores on language fidelity, source citation, risk assessment, recommendations, verification and disclaimer presence. Responsible artificial intelligence principles of grounding, transparency, fairness, privacy and accountability were embedded throughout the lifecycle. A tiered commercialisation model with enforced usage controls and a deployment strategy is presented.</w:t>
       </w:r>
     </w:p>
     <w:p>
@@ -988,7 +988,7 @@
     </w:p>
     <w:p>
       <w:r>
-        <w:t>A unified language model abstraction supports a cloud hosted production model, a development model, and a fully offline mode requiring no external credentials. The language model is used exclusively for synthesis over retrieved evidence and never as a sole knowledge source. This constraint substantially reduces fabrication. Failure of the language model service does not terminate the pipeline, as extractive fallbacks preserve continuity with an explicit indication of reduced synthesis quality.</w:t>
+        <w:t>A unified language model abstraction supports a cloud hosted production model with an automatic fallback provider. AWS Bedrock is preferred, with Google Gemini engaged whenever Bedrock credentials are missing or expired, including inside agent subprocesses and under free-tier overload conditions with retries. Calls fail over between providers automatically, so the pipeline preserves full synthesis quality instead of silently degrading. A fully offline mode requiring no external credentials remains for examination reproducibility. The language model is used exclusively for synthesis over retrieved evidence and never as a sole knowledge source. This constraint substantially reduces fabrication. Failure of all language model services does not terminate the pipeline, as extractive fallbacks preserve continuity with an explicit indication of reduced synthesis quality.</w:t>
       </w:r>
     </w:p>
     <w:p>
@@ -1001,7 +1001,7 @@
     </w:p>
     <w:p>
       <w:r>
-        <w:t>Language identification is performed through script analysis across Latin, Sinhala and Tamil ranges, and responses are rendered in the detected language. Location recognition employs a gazetteer of Sri Lankan districts extended with inflected Sinhala and Tamil forms, including handling of locative inflections that alter word stems. Topic classification covers floods, landslides, cyclones, droughts, heat waves, monsoons and general weather conditions, with careful ordering of specific hazards before generic weather terms. Query normalisation corrects common typographical errors and case variation while leaving Sinhala and Tamil inputs unaltered. Summarisation is abstractive when language model synthesis is available and extractive otherwise.</w:t>
+        <w:t>Language identification is performed through script analysis across Latin, Sinhala and Tamil ranges, and responses are rendered in the detected language. Location recognition employs a gazetteer maintained as separate lists totalling three hundred and seventy five entries: twenty five districts, twenty four district spelling variants, two hundred and fifty five cities and towns mapped to their districts, nine provinces, eleven regions and landmarks, and fifty one Sinhala and Tamil names. Combined longest-first matching with the generic country entry pinned last preserves precision. Bare place names are answered as implicit weather requests with the spelling correction shown. Topic and intent keyword matching uses word boundaries for English so that substrings do not misfire, while Sinhala and Tamil retain substring matching. Query normalisation corrects common typographical errors while leaving Sinhala and Tamil inputs and off-topic signal words unaltered. Role inference covers seven user types with query wording overriding stored settings, and management language takes priority so that school administrators are not misclassified as students. Summarisation is abstractive when language model synthesis is available and extractive otherwise.</w:t>
       </w:r>
     </w:p>
     <w:p>
@@ -1014,7 +1014,7 @@
     </w:p>
     <w:p>
       <w:r>
-        <w:t>The curated corpus was indexed in a local vector store using term frequency based representations for deterministic offline evaluation, with provision for neural embeddings in production. A cross lingual bridge maps Sinhala and Tamil query terms to English retrieval terms without external dependencies, addressing lexical mismatch between non-English queries and predominantly English documents. Retrieved candidates are filtered by location, merged with live observations where available, and assigned reliability scores. Read only search functions are publicly available, while index modification is restricted to administrators.</w:t>
+        <w:t>The curated corpus was indexed in a local vector store using term frequency based representations for deterministic offline evaluation, with provision for neural embeddings in production. A cross lingual bridge maps Sinhala and Tamil query terms to English retrieval terms without external dependencies, addressing lexical mismatch between non-English queries and predominantly English documents. Retrieved candidates are filtered by location, merged with live observations where available, and assigned reliability scores. Queries admitted without an explicit topic word receive a role sensitive default so retrieval never returns empty on that account, and empty results trigger one immediate retry before any failure is reported. Read only search functions are publicly available, while index modification is restricted to administrators.</w:t>
       </w:r>
     </w:p>
     <w:p>
@@ -1208,7 +1208,7 @@
                 <w:rFonts w:ascii="Times New Roman" w:hAnsi="Times New Roman"/>
                 <w:sz w:val="22"/>
               </w:rPr>
-              <w:t>Validation, sanitisation and prompt injection screening prior to processing</w:t>
+              <w:t>Validation, word-boundary sanitisation and prompt injection screening prior to processing, with off-topic screening applied before spelling correction so tell-tale terms cannot be rewritten away</w:t>
             </w:r>
           </w:p>
         </w:tc>
@@ -1406,7 +1406,7 @@
     </w:p>
     <w:p>
       <w:r>
-        <w:t>The web interface provides a conversational view with suggestion prompts, risk indicators, cited evidence, confidence presentation and spoken responses. A sidebar displays conversation history and live usage against the current subscription. Dedicated views support personalisation, appearance preferences, notification management, data management and subscription administration, including organisational membership and audit review for enterprise users. Voice input and audio playback support accessibility and low literacy contexts.</w:t>
+        <w:t>The web interface provides a conversational view with suggestion prompts, risk indicators, cited evidence, confidence presentation and spoken responses. A sidebar displays conversation history and live usage against the current subscription. Dedicated views support personalisation across seven user roles including traveller, appearance preferences, notification management, data management and subscription administration, including organisational membership and audit review for enterprise users. Voice input and audio playback support accessibility and low literacy contexts.</w:t>
       </w:r>
     </w:p>
     <w:p>
@@ -2713,7 +2713,7 @@
     </w:p>
     <w:p>
       <w:r>
-        <w:t>Further work includes authenticated service to service communication for production, continuous scheduling infrastructure for proactive alerting, full payment provider integration beyond the labelled demonstration flow, expanded golden query sets, latency and service level characterisation, and adversarial evaluation of injection resistance.</w:t>
+        <w:t>Further work includes authenticated service to service communication for production, continuous scheduling infrastructure for proactive alerting, full payment provider integration beyond the labelled demonstration flow, expanded golden query sets, latency and service level characterisation, and adversarial evaluation of injection resistance. Credential expiry handling is already mitigated by automatic provider failover demonstrated during the project.</w:t>
       </w:r>
     </w:p>
     <w:p>

</xml_diff>